<commit_message>
add quiz exam answer key folder project
</commit_message>
<xml_diff>
--- a/exam-docs/WADS_Quiz.docx
+++ b/exam-docs/WADS_Quiz.docx
@@ -94,7 +94,25 @@
           <w:sz w:val="21"/>
           <w:szCs w:val="21"/>
         </w:rPr>
-        <w:t xml:space="preserve">COMP67030001  |  Semester 4  |  Duration: </w:t>
+        <w:t>COMP</w:t>
+      </w:r>
+      <w:proofErr w:type="gramStart"/>
+      <w:r>
+        <w:rPr>
+          <w:color w:val="555555"/>
+          <w:sz w:val="21"/>
+          <w:szCs w:val="21"/>
+        </w:rPr>
+        <w:t>67030001  |</w:t>
+      </w:r>
+      <w:proofErr w:type="gramEnd"/>
+      <w:r>
+        <w:rPr>
+          <w:color w:val="555555"/>
+          <w:sz w:val="21"/>
+          <w:szCs w:val="21"/>
+        </w:rPr>
+        <w:t xml:space="preserve">  Semester 4  |  Duration: </w:t>
       </w:r>
       <w:r>
         <w:rPr>
@@ -1429,7 +1447,29 @@
           <w:sz w:val="24"/>
           <w:szCs w:val="24"/>
         </w:rPr>
-        <w:t>SECTION A — API Testing &amp; DB Schema / ORM   [10 marks]</w:t>
+        <w:t>SECTION A — API Testing &amp; DB Schema / ORM</w:t>
+      </w:r>
+      <w:proofErr w:type="gramStart"/>
+      <w:r>
+        <w:rPr>
+          <w:b/>
+          <w:bCs/>
+          <w:color w:val="FFFFFF"/>
+          <w:sz w:val="24"/>
+          <w:szCs w:val="24"/>
+        </w:rPr>
+        <w:t xml:space="preserve">   [</w:t>
+      </w:r>
+      <w:proofErr w:type="gramEnd"/>
+      <w:r>
+        <w:rPr>
+          <w:b/>
+          <w:bCs/>
+          <w:color w:val="FFFFFF"/>
+          <w:sz w:val="24"/>
+          <w:szCs w:val="24"/>
+        </w:rPr>
+        <w:t>10 marks]</w:t>
       </w:r>
     </w:p>
     <w:p>
@@ -1469,10 +1509,23 @@
           <w:bCs/>
           <w:color w:val="1F4E79"/>
         </w:rPr>
-        <w:t xml:space="preserve">[2 pts]  </w:t>
-      </w:r>
-      <w:r>
-        <w:t>A Postman request to POST /</w:t>
+        <w:t xml:space="preserve">[2 </w:t>
+      </w:r>
+      <w:proofErr w:type="gramStart"/>
+      <w:r>
+        <w:rPr>
+          <w:b/>
+          <w:bCs/>
+          <w:color w:val="1F4E79"/>
+        </w:rPr>
+        <w:t xml:space="preserve">pts]  </w:t>
+      </w:r>
+      <w:r>
+        <w:t>A</w:t>
+      </w:r>
+      <w:proofErr w:type="gramEnd"/>
+      <w:r>
+        <w:t xml:space="preserve"> Postman request to POST /</w:t>
       </w:r>
       <w:proofErr w:type="spellStart"/>
       <w:r>
@@ -1502,61 +1555,9 @@
           <w:sz w:val="20"/>
           <w:szCs w:val="20"/>
         </w:rPr>
-        <w:t>(Please answer here)________________________________________________________________________</w:t>
-      </w:r>
-    </w:p>
-    <w:p>
-      <w:pPr>
-        <w:spacing w:before="160" w:after="80"/>
-        <w:rPr>
-          <w:b/>
-          <w:bCs/>
-        </w:rPr>
-      </w:pPr>
-    </w:p>
-    <w:p>
-      <w:pPr>
-        <w:spacing w:before="160" w:after="80"/>
-      </w:pPr>
-      <w:r>
-        <w:rPr>
-          <w:b/>
-          <w:bCs/>
-        </w:rPr>
-        <w:t xml:space="preserve">Q2.  </w:t>
-      </w:r>
-      <w:r>
-        <w:rPr>
-          <w:b/>
-          <w:bCs/>
-          <w:color w:val="1F4E79"/>
-        </w:rPr>
-        <w:t xml:space="preserve">[3 pts]  </w:t>
-      </w:r>
-      <w:r>
-        <w:t xml:space="preserve">Your ORM query is: </w:t>
-      </w:r>
-      <w:proofErr w:type="spellStart"/>
-      <w:r>
-        <w:t>const</w:t>
-      </w:r>
-      <w:proofErr w:type="spellEnd"/>
-      <w:r>
-        <w:t xml:space="preserve"> user = await </w:t>
-      </w:r>
-      <w:proofErr w:type="spellStart"/>
-      <w:r>
-        <w:t>User.findOne</w:t>
-      </w:r>
-      <w:proofErr w:type="spellEnd"/>
-      <w:r>
-        <w:t>({ where: { email: 'test@mail.com' } });  Write the equivalent raw SQL statement this ORM call would produce, then explain ONE advantage of using ORM over writing that SQL directly.</w:t>
-      </w:r>
-    </w:p>
-    <w:p>
-      <w:pPr>
-        <w:spacing w:before="38" w:after="38"/>
-      </w:pPr>
+        <w:t xml:space="preserve">(Please answer </w:t>
+      </w:r>
+      <w:proofErr w:type="gramStart"/>
       <w:r>
         <w:rPr>
           <w:i/>
@@ -1564,53 +1565,9 @@
           <w:sz w:val="20"/>
           <w:szCs w:val="20"/>
         </w:rPr>
-        <w:t>(Please answer here)________________________________________________________________________</w:t>
-      </w:r>
-    </w:p>
-    <w:p>
-      <w:pPr>
-        <w:spacing w:before="160" w:after="80"/>
-        <w:rPr>
-          <w:b/>
-          <w:bCs/>
-        </w:rPr>
-      </w:pPr>
-    </w:p>
-    <w:p>
-      <w:pPr>
-        <w:spacing w:before="160" w:after="80"/>
-      </w:pPr>
-      <w:r>
-        <w:rPr>
-          <w:b/>
-          <w:bCs/>
-        </w:rPr>
-        <w:t xml:space="preserve">Q3.  </w:t>
-      </w:r>
-      <w:r>
-        <w:rPr>
-          <w:b/>
-          <w:bCs/>
-          <w:color w:val="1F4E79"/>
-        </w:rPr>
-        <w:t xml:space="preserve">[2 pts]  </w:t>
-      </w:r>
-      <w:r>
-        <w:t xml:space="preserve">Identify TWO problems in this DB schema definition and state how you would fix each one:      CREATE TABLE orders (id INT, </w:t>
-      </w:r>
-      <w:proofErr w:type="spellStart"/>
-      <w:r>
-        <w:t>user_id</w:t>
-      </w:r>
-      <w:proofErr w:type="spellEnd"/>
-      <w:r>
-        <w:t xml:space="preserve"> INT, items TEXT, total TEXT, date VARCHAR(50));</w:t>
-      </w:r>
-    </w:p>
-    <w:p>
-      <w:pPr>
-        <w:spacing w:before="38" w:after="38"/>
-      </w:pPr>
+        <w:t>here)_</w:t>
+      </w:r>
+      <w:proofErr w:type="gramEnd"/>
       <w:r>
         <w:rPr>
           <w:i/>
@@ -1618,7 +1575,7 @@
           <w:sz w:val="20"/>
           <w:szCs w:val="20"/>
         </w:rPr>
-        <w:t>(Please answer here)________________________________________________________________________</w:t>
+        <w:t>_______________________________________________________________________</w:t>
       </w:r>
     </w:p>
     <w:p>
@@ -1639,7 +1596,7 @@
           <w:b/>
           <w:bCs/>
         </w:rPr>
-        <w:t xml:space="preserve">Q4.  </w:t>
+        <w:t xml:space="preserve">Q2.  </w:t>
       </w:r>
       <w:r>
         <w:rPr>
@@ -1647,10 +1604,39 @@
           <w:bCs/>
           <w:color w:val="1F4E79"/>
         </w:rPr>
-        <w:t xml:space="preserve">[3 pts]  </w:t>
-      </w:r>
-      <w:r>
-        <w:t>Describe the steps to test a REST API endpoint manually using Postman. Your answer must include: how you set the request method and URL, how you add a JSON request body, how you check the response, and how you write one automated assertion.</w:t>
+        <w:t xml:space="preserve">[3 </w:t>
+      </w:r>
+      <w:proofErr w:type="gramStart"/>
+      <w:r>
+        <w:rPr>
+          <w:b/>
+          <w:bCs/>
+          <w:color w:val="1F4E79"/>
+        </w:rPr>
+        <w:t xml:space="preserve">pts]  </w:t>
+      </w:r>
+      <w:r>
+        <w:t>Your</w:t>
+      </w:r>
+      <w:proofErr w:type="gramEnd"/>
+      <w:r>
+        <w:t xml:space="preserve"> ORM query is: </w:t>
+      </w:r>
+      <w:proofErr w:type="spellStart"/>
+      <w:r>
+        <w:t>const</w:t>
+      </w:r>
+      <w:proofErr w:type="spellEnd"/>
+      <w:r>
+        <w:t xml:space="preserve"> user = await </w:t>
+      </w:r>
+      <w:proofErr w:type="spellStart"/>
+      <w:r>
+        <w:t>User.findOne</w:t>
+      </w:r>
+      <w:proofErr w:type="spellEnd"/>
+      <w:r>
+        <w:t>({ where: { email: 'test@mail.com' } });  Write the equivalent raw SQL statement this ORM call would produce, then explain ONE advantage of using ORM over writing that SQL directly.</w:t>
       </w:r>
     </w:p>
     <w:p>
@@ -1664,7 +1650,193 @@
           <w:sz w:val="20"/>
           <w:szCs w:val="20"/>
         </w:rPr>
-        <w:t>(Please answer here)________________________________________________________________________</w:t>
+        <w:t xml:space="preserve">(Please answer </w:t>
+      </w:r>
+      <w:proofErr w:type="gramStart"/>
+      <w:r>
+        <w:rPr>
+          <w:i/>
+          <w:iCs/>
+          <w:sz w:val="20"/>
+          <w:szCs w:val="20"/>
+        </w:rPr>
+        <w:t>here)_</w:t>
+      </w:r>
+      <w:proofErr w:type="gramEnd"/>
+      <w:r>
+        <w:rPr>
+          <w:i/>
+          <w:iCs/>
+          <w:sz w:val="20"/>
+          <w:szCs w:val="20"/>
+        </w:rPr>
+        <w:t>_______________________________________________________________________</w:t>
+      </w:r>
+    </w:p>
+    <w:p>
+      <w:pPr>
+        <w:spacing w:before="160" w:after="80"/>
+        <w:rPr>
+          <w:b/>
+          <w:bCs/>
+        </w:rPr>
+      </w:pPr>
+    </w:p>
+    <w:p>
+      <w:pPr>
+        <w:spacing w:before="160" w:after="80"/>
+      </w:pPr>
+      <w:r>
+        <w:rPr>
+          <w:b/>
+          <w:bCs/>
+        </w:rPr>
+        <w:t xml:space="preserve">Q3.  </w:t>
+      </w:r>
+      <w:r>
+        <w:rPr>
+          <w:b/>
+          <w:bCs/>
+          <w:color w:val="1F4E79"/>
+        </w:rPr>
+        <w:t xml:space="preserve">[2 </w:t>
+      </w:r>
+      <w:proofErr w:type="gramStart"/>
+      <w:r>
+        <w:rPr>
+          <w:b/>
+          <w:bCs/>
+          <w:color w:val="1F4E79"/>
+        </w:rPr>
+        <w:t xml:space="preserve">pts]  </w:t>
+      </w:r>
+      <w:r>
+        <w:t>Identify</w:t>
+      </w:r>
+      <w:proofErr w:type="gramEnd"/>
+      <w:r>
+        <w:t xml:space="preserve"> TWO problems in this DB schema definition and state how you would fix each one:      CREATE TABLE orders (id INT, </w:t>
+      </w:r>
+      <w:proofErr w:type="spellStart"/>
+      <w:r>
+        <w:t>user_id</w:t>
+      </w:r>
+      <w:proofErr w:type="spellEnd"/>
+      <w:r>
+        <w:t xml:space="preserve"> INT, items TEXT, total TEXT, date VARCHAR(50));</w:t>
+      </w:r>
+    </w:p>
+    <w:p>
+      <w:pPr>
+        <w:spacing w:before="38" w:after="38"/>
+      </w:pPr>
+      <w:r>
+        <w:rPr>
+          <w:i/>
+          <w:iCs/>
+          <w:sz w:val="20"/>
+          <w:szCs w:val="20"/>
+        </w:rPr>
+        <w:t xml:space="preserve">(Please answer </w:t>
+      </w:r>
+      <w:proofErr w:type="gramStart"/>
+      <w:r>
+        <w:rPr>
+          <w:i/>
+          <w:iCs/>
+          <w:sz w:val="20"/>
+          <w:szCs w:val="20"/>
+        </w:rPr>
+        <w:t>here)_</w:t>
+      </w:r>
+      <w:proofErr w:type="gramEnd"/>
+      <w:r>
+        <w:rPr>
+          <w:i/>
+          <w:iCs/>
+          <w:sz w:val="20"/>
+          <w:szCs w:val="20"/>
+        </w:rPr>
+        <w:t>_______________________________________________________________________</w:t>
+      </w:r>
+    </w:p>
+    <w:p>
+      <w:pPr>
+        <w:spacing w:before="160" w:after="80"/>
+        <w:rPr>
+          <w:b/>
+          <w:bCs/>
+        </w:rPr>
+      </w:pPr>
+    </w:p>
+    <w:p>
+      <w:pPr>
+        <w:spacing w:before="160" w:after="80"/>
+      </w:pPr>
+      <w:r>
+        <w:rPr>
+          <w:b/>
+          <w:bCs/>
+        </w:rPr>
+        <w:t xml:space="preserve">Q4.  </w:t>
+      </w:r>
+      <w:r>
+        <w:rPr>
+          <w:b/>
+          <w:bCs/>
+          <w:color w:val="1F4E79"/>
+        </w:rPr>
+        <w:t xml:space="preserve">[3 </w:t>
+      </w:r>
+      <w:proofErr w:type="gramStart"/>
+      <w:r>
+        <w:rPr>
+          <w:b/>
+          <w:bCs/>
+          <w:color w:val="1F4E79"/>
+        </w:rPr>
+        <w:t xml:space="preserve">pts]  </w:t>
+      </w:r>
+      <w:r>
+        <w:t>Describe</w:t>
+      </w:r>
+      <w:proofErr w:type="gramEnd"/>
+      <w:r>
+        <w:t xml:space="preserve"> the steps to test a REST API endpoint manually using Postman. Your answer must include: how you set the request method and URL, how you add a JSON request body, how you check the response, and how you write one automated assertion.</w:t>
+      </w:r>
+    </w:p>
+    <w:p>
+      <w:pPr>
+        <w:spacing w:before="38" w:after="38"/>
+      </w:pPr>
+      <w:r>
+        <w:rPr>
+          <w:i/>
+          <w:iCs/>
+          <w:sz w:val="20"/>
+          <w:szCs w:val="20"/>
+        </w:rPr>
+        <w:t xml:space="preserve">(Please answer </w:t>
+      </w:r>
+      <w:proofErr w:type="gramStart"/>
+      <w:r>
+        <w:rPr>
+          <w:i/>
+          <w:iCs/>
+          <w:sz w:val="20"/>
+          <w:szCs w:val="20"/>
+        </w:rPr>
+        <w:t>here)_</w:t>
+      </w:r>
+      <w:proofErr w:type="gramEnd"/>
+      <w:r>
+        <w:rPr>
+          <w:i/>
+          <w:iCs/>
+          <w:sz w:val="20"/>
+          <w:szCs w:val="20"/>
+        </w:rPr>
+        <w:t>_______________________________________________________________________</w:t>
       </w:r>
       <w:r>
         <w:br w:type="page"/>
@@ -1685,7 +1857,29 @@
           <w:szCs w:val="24"/>
         </w:rPr>
         <w:lastRenderedPageBreak/>
-        <w:t>SECTION B — Authentication, Authorization &amp; JWT   [10 marks]</w:t>
+        <w:t>SECTION B — Authentication, Authorization &amp; JWT</w:t>
+      </w:r>
+      <w:proofErr w:type="gramStart"/>
+      <w:r>
+        <w:rPr>
+          <w:b/>
+          <w:bCs/>
+          <w:color w:val="FFFFFF"/>
+          <w:sz w:val="24"/>
+          <w:szCs w:val="24"/>
+        </w:rPr>
+        <w:t xml:space="preserve">   [</w:t>
+      </w:r>
+      <w:proofErr w:type="gramEnd"/>
+      <w:r>
+        <w:rPr>
+          <w:b/>
+          <w:bCs/>
+          <w:color w:val="FFFFFF"/>
+          <w:sz w:val="24"/>
+          <w:szCs w:val="24"/>
+        </w:rPr>
+        <w:t>10 marks]</w:t>
       </w:r>
     </w:p>
     <w:p>
@@ -1725,10 +1919,23 @@
           <w:bCs/>
           <w:color w:val="1F4E79"/>
         </w:rPr>
-        <w:t xml:space="preserve">[2 pts]  </w:t>
-      </w:r>
-      <w:r>
-        <w:t>Explain the difference between Authentication and Authorization. Give one real-world example of each from a web application.</w:t>
+        <w:t xml:space="preserve">[2 </w:t>
+      </w:r>
+      <w:proofErr w:type="gramStart"/>
+      <w:r>
+        <w:rPr>
+          <w:b/>
+          <w:bCs/>
+          <w:color w:val="1F4E79"/>
+        </w:rPr>
+        <w:t xml:space="preserve">pts]  </w:t>
+      </w:r>
+      <w:r>
+        <w:t>Explain</w:t>
+      </w:r>
+      <w:proofErr w:type="gramEnd"/>
+      <w:r>
+        <w:t xml:space="preserve"> the difference between Authentication and Authorization. Give one real-world example of each from a web application.</w:t>
       </w:r>
     </w:p>
     <w:p>
@@ -1742,45 +1949,9 @@
           <w:sz w:val="20"/>
           <w:szCs w:val="20"/>
         </w:rPr>
-        <w:t>(Please answer here)________________________________________________________________________</w:t>
-      </w:r>
-    </w:p>
-    <w:p>
-      <w:pPr>
-        <w:spacing w:before="160" w:after="80"/>
-        <w:rPr>
-          <w:b/>
-          <w:bCs/>
-        </w:rPr>
-      </w:pPr>
-    </w:p>
-    <w:p>
-      <w:pPr>
-        <w:spacing w:before="160" w:after="80"/>
-      </w:pPr>
-      <w:r>
-        <w:rPr>
-          <w:b/>
-          <w:bCs/>
-        </w:rPr>
-        <w:t xml:space="preserve">Q6.  </w:t>
-      </w:r>
-      <w:r>
-        <w:rPr>
-          <w:b/>
-          <w:bCs/>
-          <w:color w:val="1F4E79"/>
-        </w:rPr>
-        <w:t xml:space="preserve">[3 pts]  </w:t>
-      </w:r>
-      <w:r>
-        <w:t>A JWT looks like this:   eyJhbGciOiJIUzI1NiIsInR5cCI6IkpXVCJ9 . eyJzdWIiOiI5OSIsImFkbWluIjp0cnVlfQ . &lt;signature&gt; (a) Name the three parts of a JWT. (b) What does the 'sub' claim in the payload mean? (c) Why is the signature important for security?</w:t>
-      </w:r>
-    </w:p>
-    <w:p>
-      <w:pPr>
-        <w:spacing w:before="38" w:after="38"/>
-      </w:pPr>
+        <w:t xml:space="preserve">(Please answer </w:t>
+      </w:r>
+      <w:proofErr w:type="gramStart"/>
       <w:r>
         <w:rPr>
           <w:i/>
@@ -1788,45 +1959,9 @@
           <w:sz w:val="20"/>
           <w:szCs w:val="20"/>
         </w:rPr>
-        <w:t>(Please answer here)________________________________________________________________________</w:t>
-      </w:r>
-    </w:p>
-    <w:p>
-      <w:pPr>
-        <w:spacing w:before="160" w:after="80"/>
-        <w:rPr>
-          <w:b/>
-          <w:bCs/>
-        </w:rPr>
-      </w:pPr>
-    </w:p>
-    <w:p>
-      <w:pPr>
-        <w:spacing w:before="160" w:after="80"/>
-      </w:pPr>
-      <w:r>
-        <w:rPr>
-          <w:b/>
-          <w:bCs/>
-        </w:rPr>
-        <w:t xml:space="preserve">Q7.  </w:t>
-      </w:r>
-      <w:r>
-        <w:rPr>
-          <w:b/>
-          <w:bCs/>
-          <w:color w:val="1F4E79"/>
-        </w:rPr>
-        <w:t xml:space="preserve">[2 pts]  </w:t>
-      </w:r>
-      <w:r>
-        <w:t>What is CORS and why does a browser enforce it? Give ONE specific scenario where a CORS error would occur in a React + Express application.</w:t>
-      </w:r>
-    </w:p>
-    <w:p>
-      <w:pPr>
-        <w:spacing w:before="38" w:after="38"/>
-      </w:pPr>
+        <w:t>here)_</w:t>
+      </w:r>
+      <w:proofErr w:type="gramEnd"/>
       <w:r>
         <w:rPr>
           <w:i/>
@@ -1834,7 +1969,7 @@
           <w:sz w:val="20"/>
           <w:szCs w:val="20"/>
         </w:rPr>
-        <w:t>(Please answer here)________________________________________________________________________</w:t>
+        <w:t>_______________________________________________________________________</w:t>
       </w:r>
     </w:p>
     <w:p>
@@ -1855,6 +1990,172 @@
           <w:b/>
           <w:bCs/>
         </w:rPr>
+        <w:t xml:space="preserve">Q6.  </w:t>
+      </w:r>
+      <w:r>
+        <w:rPr>
+          <w:b/>
+          <w:bCs/>
+          <w:color w:val="1F4E79"/>
+        </w:rPr>
+        <w:t xml:space="preserve">[3 </w:t>
+      </w:r>
+      <w:proofErr w:type="gramStart"/>
+      <w:r>
+        <w:rPr>
+          <w:b/>
+          <w:bCs/>
+          <w:color w:val="1F4E79"/>
+        </w:rPr>
+        <w:t xml:space="preserve">pts]  </w:t>
+      </w:r>
+      <w:r>
+        <w:t>A</w:t>
+      </w:r>
+      <w:proofErr w:type="gramEnd"/>
+      <w:r>
+        <w:t xml:space="preserve"> JWT looks like this:   eyJhbGciOiJIUzI1NiIsInR5cCI6IkpXVCJ9 . eyJzdWIiOiI5OSIsImFkbWluIjp0</w:t>
+      </w:r>
+      <w:proofErr w:type="gramStart"/>
+      <w:r>
+        <w:t>cnVlfQ .</w:t>
+      </w:r>
+      <w:proofErr w:type="gramEnd"/>
+      <w:r>
+        <w:t xml:space="preserve"> &lt;signature&gt; (a) Name the three parts of a JWT. (b) What does the 'sub' claim in the payload mean? (c) Why is the signature important for security?</w:t>
+      </w:r>
+    </w:p>
+    <w:p>
+      <w:pPr>
+        <w:spacing w:before="38" w:after="38"/>
+      </w:pPr>
+      <w:r>
+        <w:rPr>
+          <w:i/>
+          <w:iCs/>
+          <w:sz w:val="20"/>
+          <w:szCs w:val="20"/>
+        </w:rPr>
+        <w:t xml:space="preserve">(Please answer </w:t>
+      </w:r>
+      <w:proofErr w:type="gramStart"/>
+      <w:r>
+        <w:rPr>
+          <w:i/>
+          <w:iCs/>
+          <w:sz w:val="20"/>
+          <w:szCs w:val="20"/>
+        </w:rPr>
+        <w:t>here)_</w:t>
+      </w:r>
+      <w:proofErr w:type="gramEnd"/>
+      <w:r>
+        <w:rPr>
+          <w:i/>
+          <w:iCs/>
+          <w:sz w:val="20"/>
+          <w:szCs w:val="20"/>
+        </w:rPr>
+        <w:t>_______________________________________________________________________</w:t>
+      </w:r>
+    </w:p>
+    <w:p>
+      <w:pPr>
+        <w:spacing w:before="160" w:after="80"/>
+        <w:rPr>
+          <w:b/>
+          <w:bCs/>
+        </w:rPr>
+      </w:pPr>
+    </w:p>
+    <w:p>
+      <w:pPr>
+        <w:spacing w:before="160" w:after="80"/>
+      </w:pPr>
+      <w:r>
+        <w:rPr>
+          <w:b/>
+          <w:bCs/>
+        </w:rPr>
+        <w:t xml:space="preserve">Q7.  </w:t>
+      </w:r>
+      <w:r>
+        <w:rPr>
+          <w:b/>
+          <w:bCs/>
+          <w:color w:val="1F4E79"/>
+        </w:rPr>
+        <w:t xml:space="preserve">[2 </w:t>
+      </w:r>
+      <w:proofErr w:type="gramStart"/>
+      <w:r>
+        <w:rPr>
+          <w:b/>
+          <w:bCs/>
+          <w:color w:val="1F4E79"/>
+        </w:rPr>
+        <w:t xml:space="preserve">pts]  </w:t>
+      </w:r>
+      <w:r>
+        <w:t>What</w:t>
+      </w:r>
+      <w:proofErr w:type="gramEnd"/>
+      <w:r>
+        <w:t xml:space="preserve"> is CORS and why does a browser enforce it? Give ONE specific scenario where a CORS error would occur in a React + Express application.</w:t>
+      </w:r>
+    </w:p>
+    <w:p>
+      <w:pPr>
+        <w:spacing w:before="38" w:after="38"/>
+      </w:pPr>
+      <w:r>
+        <w:rPr>
+          <w:i/>
+          <w:iCs/>
+          <w:sz w:val="20"/>
+          <w:szCs w:val="20"/>
+        </w:rPr>
+        <w:t xml:space="preserve">(Please answer </w:t>
+      </w:r>
+      <w:proofErr w:type="gramStart"/>
+      <w:r>
+        <w:rPr>
+          <w:i/>
+          <w:iCs/>
+          <w:sz w:val="20"/>
+          <w:szCs w:val="20"/>
+        </w:rPr>
+        <w:t>here)_</w:t>
+      </w:r>
+      <w:proofErr w:type="gramEnd"/>
+      <w:r>
+        <w:rPr>
+          <w:i/>
+          <w:iCs/>
+          <w:sz w:val="20"/>
+          <w:szCs w:val="20"/>
+        </w:rPr>
+        <w:t>_______________________________________________________________________</w:t>
+      </w:r>
+    </w:p>
+    <w:p>
+      <w:pPr>
+        <w:spacing w:before="160" w:after="80"/>
+        <w:rPr>
+          <w:b/>
+          <w:bCs/>
+        </w:rPr>
+      </w:pPr>
+    </w:p>
+    <w:p>
+      <w:pPr>
+        <w:spacing w:before="160" w:after="80"/>
+      </w:pPr>
+      <w:r>
+        <w:rPr>
+          <w:b/>
+          <w:bCs/>
+        </w:rPr>
         <w:t xml:space="preserve">Q8.  </w:t>
       </w:r>
       <w:r>
@@ -1863,10 +2164,23 @@
           <w:bCs/>
           <w:color w:val="1F4E79"/>
         </w:rPr>
-        <w:t xml:space="preserve">[3 pts]  </w:t>
-      </w:r>
-      <w:r>
-        <w:t>Compare Sessions and Cookies by completing the table below in your own words:</w:t>
+        <w:t xml:space="preserve">[3 </w:t>
+      </w:r>
+      <w:proofErr w:type="gramStart"/>
+      <w:r>
+        <w:rPr>
+          <w:b/>
+          <w:bCs/>
+          <w:color w:val="1F4E79"/>
+        </w:rPr>
+        <w:t xml:space="preserve">pts]  </w:t>
+      </w:r>
+      <w:r>
+        <w:t>Compare</w:t>
+      </w:r>
+      <w:proofErr w:type="gramEnd"/>
+      <w:r>
+        <w:t xml:space="preserve"> Sessions and Cookies by completing the table below in your own words:</w:t>
       </w:r>
     </w:p>
     <w:tbl>
@@ -2298,7 +2612,29 @@
           <w:szCs w:val="24"/>
         </w:rPr>
         <w:lastRenderedPageBreak/>
-        <w:t>SECTION C — Web Security, Validation &amp; Middleware   [10 marks]</w:t>
+        <w:t>SECTION C — Web Security, Validation &amp; Middleware</w:t>
+      </w:r>
+      <w:proofErr w:type="gramStart"/>
+      <w:r>
+        <w:rPr>
+          <w:b/>
+          <w:bCs/>
+          <w:color w:val="FFFFFF"/>
+          <w:sz w:val="24"/>
+          <w:szCs w:val="24"/>
+        </w:rPr>
+        <w:t xml:space="preserve">   [</w:t>
+      </w:r>
+      <w:proofErr w:type="gramEnd"/>
+      <w:r>
+        <w:rPr>
+          <w:b/>
+          <w:bCs/>
+          <w:color w:val="FFFFFF"/>
+          <w:sz w:val="24"/>
+          <w:szCs w:val="24"/>
+        </w:rPr>
+        <w:t>10 marks]</w:t>
       </w:r>
     </w:p>
     <w:p>
@@ -2338,10 +2674,23 @@
           <w:bCs/>
           <w:color w:val="1F4E79"/>
         </w:rPr>
-        <w:t xml:space="preserve">[3 pts]  </w:t>
-      </w:r>
-      <w:r>
-        <w:t>Look at this login request body:   { "username": "admin' OR '1'='1", "password": "x" } (a) What type of attack is this? (b) Why is it dangerous if the server uses raw SQL? (c) Write the safe Node.js parameterised query that prevents this attack.</w:t>
+        <w:t xml:space="preserve">[3 </w:t>
+      </w:r>
+      <w:proofErr w:type="gramStart"/>
+      <w:r>
+        <w:rPr>
+          <w:b/>
+          <w:bCs/>
+          <w:color w:val="1F4E79"/>
+        </w:rPr>
+        <w:t xml:space="preserve">pts]  </w:t>
+      </w:r>
+      <w:r>
+        <w:t>Look</w:t>
+      </w:r>
+      <w:proofErr w:type="gramEnd"/>
+      <w:r>
+        <w:t xml:space="preserve"> at this login request body:   { "username": "admin' OR '1'='1", "password": "x" } (a) What type of attack is this? (b) Why is it dangerous if the server uses raw SQL? (c) Write the safe Node.js parameterised query that prevents this attack.</w:t>
       </w:r>
     </w:p>
     <w:p>
@@ -2355,77 +2704,9 @@
           <w:sz w:val="20"/>
           <w:szCs w:val="20"/>
         </w:rPr>
-        <w:t>(Please answer here)________________________________________________________________________</w:t>
-      </w:r>
-    </w:p>
-    <w:p>
-      <w:pPr>
-        <w:spacing w:before="160" w:after="80"/>
-        <w:rPr>
-          <w:b/>
-          <w:bCs/>
-        </w:rPr>
-      </w:pPr>
-    </w:p>
-    <w:p>
-      <w:pPr>
-        <w:spacing w:before="160" w:after="80"/>
-      </w:pPr>
-      <w:r>
-        <w:rPr>
-          <w:b/>
-          <w:bCs/>
-        </w:rPr>
-        <w:t xml:space="preserve">Q10.  </w:t>
-      </w:r>
-      <w:r>
-        <w:rPr>
-          <w:b/>
-          <w:bCs/>
-          <w:color w:val="1F4E79"/>
-        </w:rPr>
-        <w:t xml:space="preserve">[2 pts]  </w:t>
-      </w:r>
-      <w:r>
-        <w:t xml:space="preserve">A developer wrote this error handler:      </w:t>
-      </w:r>
-      <w:proofErr w:type="spellStart"/>
-      <w:r>
-        <w:t>app.use</w:t>
-      </w:r>
-      <w:proofErr w:type="spellEnd"/>
-      <w:r>
-        <w:t xml:space="preserve">((err, </w:t>
-      </w:r>
-      <w:proofErr w:type="spellStart"/>
-      <w:r>
-        <w:t>req</w:t>
-      </w:r>
-      <w:proofErr w:type="spellEnd"/>
-      <w:r>
-        <w:t xml:space="preserve">, res, next) =&gt; { </w:t>
-      </w:r>
-      <w:proofErr w:type="spellStart"/>
-      <w:r>
-        <w:t>res.json</w:t>
-      </w:r>
-      <w:proofErr w:type="spellEnd"/>
-      <w:r>
-        <w:t xml:space="preserve">({ error: </w:t>
-      </w:r>
-      <w:proofErr w:type="spellStart"/>
-      <w:r>
-        <w:t>err.stack</w:t>
-      </w:r>
-      <w:proofErr w:type="spellEnd"/>
-      <w:r>
-        <w:t xml:space="preserve"> }); }); Identify TWO security problems with this code and write a corrected version.</w:t>
-      </w:r>
-    </w:p>
-    <w:p>
-      <w:pPr>
-        <w:spacing w:before="38" w:after="38"/>
-      </w:pPr>
+        <w:t xml:space="preserve">(Please answer </w:t>
+      </w:r>
+      <w:proofErr w:type="gramStart"/>
       <w:r>
         <w:rPr>
           <w:i/>
@@ -2433,45 +2714,9 @@
           <w:sz w:val="20"/>
           <w:szCs w:val="20"/>
         </w:rPr>
-        <w:t>(Please answer here)________________________________________________________________________</w:t>
-      </w:r>
-    </w:p>
-    <w:p>
-      <w:pPr>
-        <w:spacing w:before="160" w:after="80"/>
-        <w:rPr>
-          <w:b/>
-          <w:bCs/>
-        </w:rPr>
-      </w:pPr>
-    </w:p>
-    <w:p>
-      <w:pPr>
-        <w:spacing w:before="160" w:after="80"/>
-      </w:pPr>
-      <w:r>
-        <w:rPr>
-          <w:b/>
-          <w:bCs/>
-        </w:rPr>
-        <w:t xml:space="preserve">Q11.  </w:t>
-      </w:r>
-      <w:r>
-        <w:rPr>
-          <w:b/>
-          <w:bCs/>
-          <w:color w:val="1F4E79"/>
-        </w:rPr>
-        <w:t xml:space="preserve">[2 pts]  </w:t>
-      </w:r>
-      <w:r>
-        <w:t>Explain the difference between input validation and input sanitisation. Give one example of each for a user registration form.</w:t>
-      </w:r>
-    </w:p>
-    <w:p>
-      <w:pPr>
-        <w:spacing w:before="38" w:after="38"/>
-      </w:pPr>
+        <w:t>here)_</w:t>
+      </w:r>
+      <w:proofErr w:type="gramEnd"/>
       <w:r>
         <w:rPr>
           <w:i/>
@@ -2479,7 +2724,7 @@
           <w:sz w:val="20"/>
           <w:szCs w:val="20"/>
         </w:rPr>
-        <w:t>(Please answer here)________________________________________________________________________</w:t>
+        <w:t>_______________________________________________________________________</w:t>
       </w:r>
     </w:p>
     <w:p>
@@ -2500,6 +2745,196 @@
           <w:b/>
           <w:bCs/>
         </w:rPr>
+        <w:t xml:space="preserve">Q10.  </w:t>
+      </w:r>
+      <w:r>
+        <w:rPr>
+          <w:b/>
+          <w:bCs/>
+          <w:color w:val="1F4E79"/>
+        </w:rPr>
+        <w:t xml:space="preserve">[2 </w:t>
+      </w:r>
+      <w:proofErr w:type="gramStart"/>
+      <w:r>
+        <w:rPr>
+          <w:b/>
+          <w:bCs/>
+          <w:color w:val="1F4E79"/>
+        </w:rPr>
+        <w:t xml:space="preserve">pts]  </w:t>
+      </w:r>
+      <w:r>
+        <w:t>A</w:t>
+      </w:r>
+      <w:proofErr w:type="gramEnd"/>
+      <w:r>
+        <w:t xml:space="preserve"> developer wrote this error handler:      </w:t>
+      </w:r>
+      <w:proofErr w:type="spellStart"/>
+      <w:r>
+        <w:t>app.use</w:t>
+      </w:r>
+      <w:proofErr w:type="spellEnd"/>
+      <w:r>
+        <w:t xml:space="preserve">((err, </w:t>
+      </w:r>
+      <w:proofErr w:type="spellStart"/>
+      <w:r>
+        <w:t>req</w:t>
+      </w:r>
+      <w:proofErr w:type="spellEnd"/>
+      <w:r>
+        <w:t xml:space="preserve">, res, next) =&gt; { </w:t>
+      </w:r>
+      <w:proofErr w:type="spellStart"/>
+      <w:r>
+        <w:t>res.json</w:t>
+      </w:r>
+      <w:proofErr w:type="spellEnd"/>
+      <w:r>
+        <w:t xml:space="preserve">({ error: </w:t>
+      </w:r>
+      <w:proofErr w:type="spellStart"/>
+      <w:r>
+        <w:t>err.stack</w:t>
+      </w:r>
+      <w:proofErr w:type="spellEnd"/>
+      <w:r>
+        <w:t xml:space="preserve"> }); }); Identify TWO security problems with this code and write a corrected version.</w:t>
+      </w:r>
+    </w:p>
+    <w:p>
+      <w:pPr>
+        <w:spacing w:before="38" w:after="38"/>
+      </w:pPr>
+      <w:r>
+        <w:rPr>
+          <w:i/>
+          <w:iCs/>
+          <w:sz w:val="20"/>
+          <w:szCs w:val="20"/>
+        </w:rPr>
+        <w:t xml:space="preserve">(Please answer </w:t>
+      </w:r>
+      <w:proofErr w:type="gramStart"/>
+      <w:r>
+        <w:rPr>
+          <w:i/>
+          <w:iCs/>
+          <w:sz w:val="20"/>
+          <w:szCs w:val="20"/>
+        </w:rPr>
+        <w:t>here)_</w:t>
+      </w:r>
+      <w:proofErr w:type="gramEnd"/>
+      <w:r>
+        <w:rPr>
+          <w:i/>
+          <w:iCs/>
+          <w:sz w:val="20"/>
+          <w:szCs w:val="20"/>
+        </w:rPr>
+        <w:t>_______________________________________________________________________</w:t>
+      </w:r>
+    </w:p>
+    <w:p>
+      <w:pPr>
+        <w:spacing w:before="160" w:after="80"/>
+        <w:rPr>
+          <w:b/>
+          <w:bCs/>
+        </w:rPr>
+      </w:pPr>
+    </w:p>
+    <w:p>
+      <w:pPr>
+        <w:spacing w:before="160" w:after="80"/>
+      </w:pPr>
+      <w:r>
+        <w:rPr>
+          <w:b/>
+          <w:bCs/>
+        </w:rPr>
+        <w:t xml:space="preserve">Q11.  </w:t>
+      </w:r>
+      <w:r>
+        <w:rPr>
+          <w:b/>
+          <w:bCs/>
+          <w:color w:val="1F4E79"/>
+        </w:rPr>
+        <w:t xml:space="preserve">[2 </w:t>
+      </w:r>
+      <w:proofErr w:type="gramStart"/>
+      <w:r>
+        <w:rPr>
+          <w:b/>
+          <w:bCs/>
+          <w:color w:val="1F4E79"/>
+        </w:rPr>
+        <w:t xml:space="preserve">pts]  </w:t>
+      </w:r>
+      <w:r>
+        <w:t>Explain</w:t>
+      </w:r>
+      <w:proofErr w:type="gramEnd"/>
+      <w:r>
+        <w:t xml:space="preserve"> the difference between input validation and input sanitisation. Give one example of each for a user registration form.</w:t>
+      </w:r>
+    </w:p>
+    <w:p>
+      <w:pPr>
+        <w:spacing w:before="38" w:after="38"/>
+      </w:pPr>
+      <w:r>
+        <w:rPr>
+          <w:i/>
+          <w:iCs/>
+          <w:sz w:val="20"/>
+          <w:szCs w:val="20"/>
+        </w:rPr>
+        <w:t xml:space="preserve">(Please answer </w:t>
+      </w:r>
+      <w:proofErr w:type="gramStart"/>
+      <w:r>
+        <w:rPr>
+          <w:i/>
+          <w:iCs/>
+          <w:sz w:val="20"/>
+          <w:szCs w:val="20"/>
+        </w:rPr>
+        <w:t>here)_</w:t>
+      </w:r>
+      <w:proofErr w:type="gramEnd"/>
+      <w:r>
+        <w:rPr>
+          <w:i/>
+          <w:iCs/>
+          <w:sz w:val="20"/>
+          <w:szCs w:val="20"/>
+        </w:rPr>
+        <w:t>_______________________________________________________________________</w:t>
+      </w:r>
+    </w:p>
+    <w:p>
+      <w:pPr>
+        <w:spacing w:before="160" w:after="80"/>
+        <w:rPr>
+          <w:b/>
+          <w:bCs/>
+        </w:rPr>
+      </w:pPr>
+    </w:p>
+    <w:p>
+      <w:pPr>
+        <w:spacing w:before="160" w:after="80"/>
+      </w:pPr>
+      <w:r>
+        <w:rPr>
+          <w:b/>
+          <w:bCs/>
+        </w:rPr>
         <w:t xml:space="preserve">Q12.  </w:t>
       </w:r>
       <w:r>
@@ -2508,10 +2943,23 @@
           <w:bCs/>
           <w:color w:val="1F4E79"/>
         </w:rPr>
-        <w:t xml:space="preserve">[3 pts]  </w:t>
-      </w:r>
-      <w:r>
-        <w:t>Design a simple middleware chain for a POST /</w:t>
+        <w:t xml:space="preserve">[3 </w:t>
+      </w:r>
+      <w:proofErr w:type="gramStart"/>
+      <w:r>
+        <w:rPr>
+          <w:b/>
+          <w:bCs/>
+          <w:color w:val="1F4E79"/>
+        </w:rPr>
+        <w:t xml:space="preserve">pts]  </w:t>
+      </w:r>
+      <w:r>
+        <w:t>Design</w:t>
+      </w:r>
+      <w:proofErr w:type="gramEnd"/>
+      <w:r>
+        <w:t xml:space="preserve"> a simple middleware chain for a POST /</w:t>
       </w:r>
       <w:proofErr w:type="spellStart"/>
       <w:r>
@@ -2974,7 +3422,29 @@
           <w:szCs w:val="24"/>
         </w:rPr>
         <w:lastRenderedPageBreak/>
-        <w:t>SECTION D — Docker, CI/CD &amp; Deployment   [10 marks]</w:t>
+        <w:t>SECTION D — Docker, CI/CD &amp; Deployment</w:t>
+      </w:r>
+      <w:proofErr w:type="gramStart"/>
+      <w:r>
+        <w:rPr>
+          <w:b/>
+          <w:bCs/>
+          <w:color w:val="FFFFFF"/>
+          <w:sz w:val="24"/>
+          <w:szCs w:val="24"/>
+        </w:rPr>
+        <w:t xml:space="preserve">   [</w:t>
+      </w:r>
+      <w:proofErr w:type="gramEnd"/>
+      <w:r>
+        <w:rPr>
+          <w:b/>
+          <w:bCs/>
+          <w:color w:val="FFFFFF"/>
+          <w:sz w:val="24"/>
+          <w:szCs w:val="24"/>
+        </w:rPr>
+        <w:t>10 marks]</w:t>
       </w:r>
     </w:p>
     <w:p>
@@ -3036,10 +3506,23 @@
           <w:bCs/>
           <w:color w:val="1F4E79"/>
         </w:rPr>
-        <w:t xml:space="preserve">[3 pts]  </w:t>
-      </w:r>
-      <w:r>
-        <w:t xml:space="preserve">Explain the difference between a Docker Image and a Docker Container. Then describe the purpose of each instruction in this </w:t>
+        <w:t xml:space="preserve">[3 </w:t>
+      </w:r>
+      <w:proofErr w:type="gramStart"/>
+      <w:r>
+        <w:rPr>
+          <w:b/>
+          <w:bCs/>
+          <w:color w:val="1F4E79"/>
+        </w:rPr>
+        <w:t xml:space="preserve">pts]  </w:t>
+      </w:r>
+      <w:r>
+        <w:t>Explain</w:t>
+      </w:r>
+      <w:proofErr w:type="gramEnd"/>
+      <w:r>
+        <w:t xml:space="preserve"> the difference between a Docker Image and a Docker Container. Then describe the purpose of each instruction in this </w:t>
       </w:r>
       <w:proofErr w:type="spellStart"/>
       <w:r>
@@ -3047,7 +3530,15 @@
       </w:r>
       <w:proofErr w:type="spellEnd"/>
       <w:r>
-        <w:t xml:space="preserve"> snippet:      FROM node:22-alpine      WORKDIR /app      COPY package*.json ./      RUN </w:t>
+        <w:t xml:space="preserve"> snippet:      FROM node:22-alpine      WORKDIR /app      COPY package</w:t>
+      </w:r>
+      <w:proofErr w:type="gramStart"/>
+      <w:r>
+        <w:t>*.json</w:t>
+      </w:r>
+      <w:proofErr w:type="gramEnd"/>
+      <w:r>
+        <w:t xml:space="preserve"> ./      RUN </w:t>
       </w:r>
       <w:proofErr w:type="spellStart"/>
       <w:r>
@@ -3069,101 +3560,9 @@
           <w:sz w:val="20"/>
           <w:szCs w:val="20"/>
         </w:rPr>
-        <w:t>(Please answer here)________________________________________________________________________</w:t>
-      </w:r>
-    </w:p>
-    <w:p>
-      <w:pPr>
-        <w:spacing w:before="160" w:after="80"/>
-        <w:rPr>
-          <w:b/>
-          <w:bCs/>
-        </w:rPr>
-      </w:pPr>
-    </w:p>
-    <w:p>
-      <w:pPr>
-        <w:spacing w:before="160" w:after="80"/>
-      </w:pPr>
-      <w:r>
-        <w:rPr>
-          <w:b/>
-          <w:bCs/>
-        </w:rPr>
-        <w:t xml:space="preserve">Q14.  </w:t>
-      </w:r>
-      <w:r>
-        <w:rPr>
-          <w:b/>
-          <w:bCs/>
-          <w:color w:val="1F4E79"/>
-        </w:rPr>
-        <w:t xml:space="preserve">[2 pts]  </w:t>
-      </w:r>
-      <w:r>
-        <w:t>A docker-</w:t>
-      </w:r>
-      <w:proofErr w:type="spellStart"/>
-      <w:r>
-        <w:t>compose.yml</w:t>
-      </w:r>
-      <w:proofErr w:type="spellEnd"/>
-      <w:r>
-        <w:t xml:space="preserve"> has: </w:t>
-      </w:r>
-      <w:proofErr w:type="spellStart"/>
-      <w:r>
-        <w:t>depends_on</w:t>
-      </w:r>
-      <w:proofErr w:type="spellEnd"/>
-      <w:r>
-        <w:t>: [</w:t>
-      </w:r>
-      <w:proofErr w:type="spellStart"/>
-      <w:r>
-        <w:t>db</w:t>
-      </w:r>
-      <w:proofErr w:type="spellEnd"/>
-      <w:r>
-        <w:t xml:space="preserve">] for the </w:t>
-      </w:r>
-      <w:proofErr w:type="spellStart"/>
-      <w:r>
-        <w:t>api</w:t>
-      </w:r>
-      <w:proofErr w:type="spellEnd"/>
-      <w:r>
-        <w:t xml:space="preserve"> service. The </w:t>
-      </w:r>
-      <w:proofErr w:type="spellStart"/>
-      <w:r>
-        <w:t>api</w:t>
-      </w:r>
-      <w:proofErr w:type="spellEnd"/>
-      <w:r>
-        <w:t xml:space="preserve"> still crashes because the database is not ready. (a) Why does </w:t>
-      </w:r>
-      <w:proofErr w:type="spellStart"/>
-      <w:r>
-        <w:t>depends_on</w:t>
-      </w:r>
-      <w:proofErr w:type="spellEnd"/>
-      <w:r>
-        <w:t xml:space="preserve"> alone NOT guarantee the database is ready?  (b) What must you add to the </w:t>
-      </w:r>
-      <w:proofErr w:type="spellStart"/>
-      <w:r>
-        <w:t>db</w:t>
-      </w:r>
-      <w:proofErr w:type="spellEnd"/>
-      <w:r>
-        <w:t xml:space="preserve"> service to fix this?</w:t>
-      </w:r>
-    </w:p>
-    <w:p>
-      <w:pPr>
-        <w:spacing w:before="38" w:after="38"/>
-      </w:pPr>
+        <w:t xml:space="preserve">(Please answer </w:t>
+      </w:r>
+      <w:proofErr w:type="gramStart"/>
       <w:r>
         <w:rPr>
           <w:i/>
@@ -3171,45 +3570,9 @@
           <w:sz w:val="20"/>
           <w:szCs w:val="20"/>
         </w:rPr>
-        <w:t>(Please answer here)________________________________________________________________________</w:t>
-      </w:r>
-    </w:p>
-    <w:p>
-      <w:pPr>
-        <w:spacing w:before="160" w:after="80"/>
-        <w:rPr>
-          <w:b/>
-          <w:bCs/>
-        </w:rPr>
-      </w:pPr>
-    </w:p>
-    <w:p>
-      <w:pPr>
-        <w:spacing w:before="160" w:after="80"/>
-      </w:pPr>
-      <w:r>
-        <w:rPr>
-          <w:b/>
-          <w:bCs/>
-        </w:rPr>
-        <w:t xml:space="preserve">Q15.  </w:t>
-      </w:r>
-      <w:r>
-        <w:rPr>
-          <w:b/>
-          <w:bCs/>
-          <w:color w:val="1F4E79"/>
-        </w:rPr>
-        <w:t xml:space="preserve">[2 pts]  </w:t>
-      </w:r>
-      <w:r>
-        <w:t>Describe the role of GitHub Actions in a CI/CD pipeline. What happens automatically when a developer pushes code to the main branch? List at least THREE steps the pipeline would run.</w:t>
-      </w:r>
-    </w:p>
-    <w:p>
-      <w:pPr>
-        <w:spacing w:before="38" w:after="38"/>
-      </w:pPr>
+        <w:t>here)_</w:t>
+      </w:r>
+      <w:proofErr w:type="gramEnd"/>
       <w:r>
         <w:rPr>
           <w:i/>
@@ -3217,7 +3580,7 @@
           <w:sz w:val="20"/>
           <w:szCs w:val="20"/>
         </w:rPr>
-        <w:t>(Please answer here)________________________________________________________________________</w:t>
+        <w:t>_______________________________________________________________________</w:t>
       </w:r>
     </w:p>
     <w:p>
@@ -3238,7 +3601,7 @@
           <w:b/>
           <w:bCs/>
         </w:rPr>
-        <w:t xml:space="preserve">Q16.  </w:t>
+        <w:t xml:space="preserve">Q14.  </w:t>
       </w:r>
       <w:r>
         <w:rPr>
@@ -3246,26 +3609,79 @@
           <w:bCs/>
           <w:color w:val="1F4E79"/>
         </w:rPr>
-        <w:t xml:space="preserve">[3 pts]  </w:t>
-      </w:r>
-      <w:r>
-        <w:t xml:space="preserve">After deployment you run: docker compose logs </w:t>
+        <w:t xml:space="preserve">[2 </w:t>
+      </w:r>
+      <w:proofErr w:type="gramStart"/>
+      <w:r>
+        <w:rPr>
+          <w:b/>
+          <w:bCs/>
+          <w:color w:val="1F4E79"/>
+        </w:rPr>
+        <w:t xml:space="preserve">pts]  </w:t>
+      </w:r>
+      <w:r>
+        <w:t>A</w:t>
+      </w:r>
+      <w:proofErr w:type="gramEnd"/>
+      <w:r>
+        <w:t xml:space="preserve"> docker-</w:t>
       </w:r>
       <w:proofErr w:type="spellStart"/>
       <w:r>
+        <w:t>compose.yml</w:t>
+      </w:r>
+      <w:proofErr w:type="spellEnd"/>
+      <w:r>
+        <w:t xml:space="preserve"> has: </w:t>
+      </w:r>
+      <w:proofErr w:type="spellStart"/>
+      <w:r>
+        <w:t>depends_on</w:t>
+      </w:r>
+      <w:proofErr w:type="spellEnd"/>
+      <w:r>
+        <w:t>: [</w:t>
+      </w:r>
+      <w:proofErr w:type="spellStart"/>
+      <w:r>
+        <w:t>db</w:t>
+      </w:r>
+      <w:proofErr w:type="spellEnd"/>
+      <w:r>
+        <w:t xml:space="preserve">] for the </w:t>
+      </w:r>
+      <w:proofErr w:type="spellStart"/>
+      <w:r>
         <w:t>api</w:t>
       </w:r>
       <w:proofErr w:type="spellEnd"/>
       <w:r>
-        <w:t xml:space="preserve"> --tail=100 The log shows:      [INFO]  Server started on port 3000      [ERROR] FATAL: password authentication failed for user "app" (a) Write the bash command using grep that checks for the </w:t>
+        <w:t xml:space="preserve"> service. The </w:t>
       </w:r>
       <w:proofErr w:type="spellStart"/>
       <w:r>
-        <w:t>startup</w:t>
+        <w:t>api</w:t>
       </w:r>
       <w:proofErr w:type="spellEnd"/>
       <w:r>
-        <w:t xml:space="preserve"> message. (b) Write the bash command that would FAIL if a FATAL error exists. (c) What is the most likely cause of the FATAL error and how do you fix it?</w:t>
+        <w:t xml:space="preserve"> still crashes because the database is not ready. (a) Why does </w:t>
+      </w:r>
+      <w:proofErr w:type="spellStart"/>
+      <w:r>
+        <w:t>depends_on</w:t>
+      </w:r>
+      <w:proofErr w:type="spellEnd"/>
+      <w:r>
+        <w:t xml:space="preserve"> alone NOT guarantee the database is ready?  (b) What must you add to the </w:t>
+      </w:r>
+      <w:proofErr w:type="spellStart"/>
+      <w:r>
+        <w:t>db</w:t>
+      </w:r>
+      <w:proofErr w:type="spellEnd"/>
+      <w:r>
+        <w:t xml:space="preserve"> service to fix this?</w:t>
       </w:r>
     </w:p>
     <w:p>
@@ -3279,8 +3695,9 @@
           <w:sz w:val="20"/>
           <w:szCs w:val="20"/>
         </w:rPr>
-        <w:t>(Please answer here)</w:t>
-      </w:r>
+        <w:t xml:space="preserve">(Please answer </w:t>
+      </w:r>
+      <w:proofErr w:type="gramStart"/>
       <w:r>
         <w:rPr>
           <w:i/>
@@ -3288,7 +3705,200 @@
           <w:sz w:val="20"/>
           <w:szCs w:val="20"/>
         </w:rPr>
-        <w:t>_____________________________________________________</w:t>
+        <w:t>here)_</w:t>
+      </w:r>
+      <w:proofErr w:type="gramEnd"/>
+      <w:r>
+        <w:rPr>
+          <w:i/>
+          <w:iCs/>
+          <w:sz w:val="20"/>
+          <w:szCs w:val="20"/>
+        </w:rPr>
+        <w:t>_______________________________________________________________________</w:t>
+      </w:r>
+    </w:p>
+    <w:p>
+      <w:pPr>
+        <w:spacing w:before="160" w:after="80"/>
+        <w:rPr>
+          <w:b/>
+          <w:bCs/>
+        </w:rPr>
+      </w:pPr>
+    </w:p>
+    <w:p>
+      <w:pPr>
+        <w:spacing w:before="160" w:after="80"/>
+      </w:pPr>
+      <w:r>
+        <w:rPr>
+          <w:b/>
+          <w:bCs/>
+        </w:rPr>
+        <w:t xml:space="preserve">Q15.  </w:t>
+      </w:r>
+      <w:r>
+        <w:rPr>
+          <w:b/>
+          <w:bCs/>
+          <w:color w:val="1F4E79"/>
+        </w:rPr>
+        <w:t xml:space="preserve">[2 </w:t>
+      </w:r>
+      <w:proofErr w:type="gramStart"/>
+      <w:r>
+        <w:rPr>
+          <w:b/>
+          <w:bCs/>
+          <w:color w:val="1F4E79"/>
+        </w:rPr>
+        <w:t xml:space="preserve">pts]  </w:t>
+      </w:r>
+      <w:r>
+        <w:t>Describe</w:t>
+      </w:r>
+      <w:proofErr w:type="gramEnd"/>
+      <w:r>
+        <w:t xml:space="preserve"> the role of GitHub Actions in a CI/CD pipeline. What happens automatically when a developer pushes code to the main branch? List at least THREE steps the pipeline would run.</w:t>
+      </w:r>
+    </w:p>
+    <w:p>
+      <w:pPr>
+        <w:spacing w:before="38" w:after="38"/>
+      </w:pPr>
+      <w:r>
+        <w:rPr>
+          <w:i/>
+          <w:iCs/>
+          <w:sz w:val="20"/>
+          <w:szCs w:val="20"/>
+        </w:rPr>
+        <w:t xml:space="preserve">(Please answer </w:t>
+      </w:r>
+      <w:proofErr w:type="gramStart"/>
+      <w:r>
+        <w:rPr>
+          <w:i/>
+          <w:iCs/>
+          <w:sz w:val="20"/>
+          <w:szCs w:val="20"/>
+        </w:rPr>
+        <w:t>here)_</w:t>
+      </w:r>
+      <w:proofErr w:type="gramEnd"/>
+      <w:r>
+        <w:rPr>
+          <w:i/>
+          <w:iCs/>
+          <w:sz w:val="20"/>
+          <w:szCs w:val="20"/>
+        </w:rPr>
+        <w:t>_______________________________________________________________________</w:t>
+      </w:r>
+    </w:p>
+    <w:p>
+      <w:pPr>
+        <w:spacing w:before="160" w:after="80"/>
+        <w:rPr>
+          <w:b/>
+          <w:bCs/>
+        </w:rPr>
+      </w:pPr>
+    </w:p>
+    <w:p>
+      <w:pPr>
+        <w:spacing w:before="160" w:after="80"/>
+      </w:pPr>
+      <w:r>
+        <w:rPr>
+          <w:b/>
+          <w:bCs/>
+        </w:rPr>
+        <w:t xml:space="preserve">Q16.  </w:t>
+      </w:r>
+      <w:r>
+        <w:rPr>
+          <w:b/>
+          <w:bCs/>
+          <w:color w:val="1F4E79"/>
+        </w:rPr>
+        <w:t xml:space="preserve">[3 </w:t>
+      </w:r>
+      <w:proofErr w:type="gramStart"/>
+      <w:r>
+        <w:rPr>
+          <w:b/>
+          <w:bCs/>
+          <w:color w:val="1F4E79"/>
+        </w:rPr>
+        <w:t xml:space="preserve">pts]  </w:t>
+      </w:r>
+      <w:r>
+        <w:t>After</w:t>
+      </w:r>
+      <w:proofErr w:type="gramEnd"/>
+      <w:r>
+        <w:t xml:space="preserve"> deployment you run: docker compose logs </w:t>
+      </w:r>
+      <w:proofErr w:type="spellStart"/>
+      <w:r>
+        <w:t>api</w:t>
+      </w:r>
+      <w:proofErr w:type="spellEnd"/>
+      <w:r>
+        <w:t xml:space="preserve"> --tail=100 The log shows:      [INFO]  Server started on port 3000      [ERROR] FATAL: password authentication failed for user "app" (a) Write the bash command using grep that checks for the </w:t>
+      </w:r>
+      <w:proofErr w:type="spellStart"/>
+      <w:r>
+        <w:t>startup</w:t>
+      </w:r>
+      <w:proofErr w:type="spellEnd"/>
+      <w:r>
+        <w:t xml:space="preserve"> message. (b) Write the bash command that would FAIL if a FATAL error exists. (c) What is the most likely cause of the FATAL error and how do you fix it?</w:t>
+      </w:r>
+    </w:p>
+    <w:p>
+      <w:pPr>
+        <w:spacing w:before="38" w:after="38"/>
+      </w:pPr>
+      <w:r>
+        <w:rPr>
+          <w:i/>
+          <w:iCs/>
+          <w:sz w:val="20"/>
+          <w:szCs w:val="20"/>
+        </w:rPr>
+        <w:t xml:space="preserve">(Please answer </w:t>
+      </w:r>
+      <w:proofErr w:type="gramStart"/>
+      <w:r>
+        <w:rPr>
+          <w:i/>
+          <w:iCs/>
+          <w:sz w:val="20"/>
+          <w:szCs w:val="20"/>
+        </w:rPr>
+        <w:t>here)</w:t>
+      </w:r>
+      <w:r>
+        <w:rPr>
+          <w:i/>
+          <w:iCs/>
+          <w:sz w:val="20"/>
+          <w:szCs w:val="20"/>
+        </w:rPr>
+        <w:t>_</w:t>
+      </w:r>
+      <w:proofErr w:type="gramEnd"/>
+      <w:r>
+        <w:rPr>
+          <w:i/>
+          <w:iCs/>
+          <w:sz w:val="20"/>
+          <w:szCs w:val="20"/>
+        </w:rPr>
+        <w:t>____________________________________________________</w:t>
       </w:r>
       <w:r>
         <w:rPr>
@@ -3394,8 +4004,13 @@
         <w:spacing w:after="160" w:line="259" w:lineRule="auto"/>
         <w:contextualSpacing/>
       </w:pPr>
-      <w:r>
-        <w:t xml:space="preserve">.env configured (copy from </w:t>
+      <w:proofErr w:type="gramStart"/>
+      <w:r>
+        <w:t>.env</w:t>
+      </w:r>
+      <w:proofErr w:type="gramEnd"/>
+      <w:r>
+        <w:t xml:space="preserve"> configured (copy from </w:t>
       </w:r>
       <w:r>
         <w:rPr>
@@ -3643,6 +4258,7 @@
         <w:t xml:space="preserve"> run </w:t>
       </w:r>
       <w:proofErr w:type="spellStart"/>
+      <w:proofErr w:type="gramStart"/>
       <w:r>
         <w:rPr>
           <w:rFonts w:ascii="Cascadia Code" w:hAnsi="Cascadia Code" w:cs="Cascadia Code"/>
@@ -3650,6 +4266,7 @@
         <w:t>db:generate</w:t>
       </w:r>
       <w:proofErr w:type="spellEnd"/>
+      <w:proofErr w:type="gramEnd"/>
     </w:p>
     <w:p>
       <w:pPr>
@@ -3673,6 +4290,7 @@
         <w:t xml:space="preserve"> run </w:t>
       </w:r>
       <w:proofErr w:type="spellStart"/>
+      <w:proofErr w:type="gramStart"/>
       <w:r>
         <w:rPr>
           <w:rFonts w:ascii="Cascadia Code" w:hAnsi="Cascadia Code" w:cs="Cascadia Code"/>
@@ -3680,6 +4298,7 @@
         <w:t>db:migrate</w:t>
       </w:r>
       <w:proofErr w:type="spellEnd"/>
+      <w:proofErr w:type="gramEnd"/>
     </w:p>
     <w:p>
       <w:pPr>
@@ -3864,6 +4483,7 @@
         <w:t xml:space="preserve"> run </w:t>
       </w:r>
       <w:proofErr w:type="spellStart"/>
+      <w:proofErr w:type="gramStart"/>
       <w:r>
         <w:rPr>
           <w:rFonts w:ascii="Cascadia Code" w:hAnsi="Cascadia Code" w:cs="Cascadia Code"/>
@@ -3871,6 +4491,7 @@
         <w:t>db:migrate</w:t>
       </w:r>
       <w:proofErr w:type="spellEnd"/>
+      <w:proofErr w:type="gramEnd"/>
       <w:r>
         <w:t xml:space="preserve"> if not done.</w:t>
       </w:r>
@@ -4151,8 +4772,16 @@
         <w:rPr>
           <w:rFonts w:ascii="Cascadia Code" w:hAnsi="Cascadia Code" w:cs="Cascadia Code"/>
         </w:rPr>
-        <w:t>git add .</w:t>
-      </w:r>
+        <w:t xml:space="preserve">git </w:t>
+      </w:r>
+      <w:proofErr w:type="gramStart"/>
+      <w:r>
+        <w:rPr>
+          <w:rFonts w:ascii="Cascadia Code" w:hAnsi="Cascadia Code" w:cs="Cascadia Code"/>
+        </w:rPr>
+        <w:t>add .</w:t>
+      </w:r>
+      <w:proofErr w:type="gramEnd"/>
     </w:p>
     <w:p>
       <w:pPr>
@@ -4283,7 +4912,27 @@
           <w:sz w:val="20"/>
           <w:szCs w:val="20"/>
         </w:rPr>
-        <w:t>(Please answer here)________________________________________________________________________</w:t>
+        <w:t xml:space="preserve">(Please answer </w:t>
+      </w:r>
+      <w:proofErr w:type="gramStart"/>
+      <w:r>
+        <w:rPr>
+          <w:i/>
+          <w:iCs/>
+          <w:sz w:val="20"/>
+          <w:szCs w:val="20"/>
+        </w:rPr>
+        <w:t>here)_</w:t>
+      </w:r>
+      <w:proofErr w:type="gramEnd"/>
+      <w:r>
+        <w:rPr>
+          <w:i/>
+          <w:iCs/>
+          <w:sz w:val="20"/>
+          <w:szCs w:val="20"/>
+        </w:rPr>
+        <w:t>_______________________________________________________________________</w:t>
       </w:r>
     </w:p>
     <w:p>
@@ -4384,7 +5033,11 @@
         <w:contextualSpacing/>
       </w:pPr>
       <w:r>
-        <w:t xml:space="preserve">Copy Firebase web app credentials into </w:t>
+        <w:t xml:space="preserve">Copy Firebase web app credentials </w:t>
+      </w:r>
+      <w:proofErr w:type="gramStart"/>
+      <w:r>
+        <w:t xml:space="preserve">into </w:t>
       </w:r>
       <w:r>
         <w:rPr>
@@ -4392,6 +5045,7 @@
         </w:rPr>
         <w:t>.env</w:t>
       </w:r>
+      <w:proofErr w:type="gramEnd"/>
       <w:r>
         <w:t xml:space="preserve"> using the correct variable names.</w:t>
       </w:r>
@@ -4635,7 +5289,27 @@
           <w:sz w:val="20"/>
           <w:szCs w:val="20"/>
         </w:rPr>
-        <w:t>(Please answer here)________________________________________________________________________</w:t>
+        <w:t xml:space="preserve">(Please answer </w:t>
+      </w:r>
+      <w:proofErr w:type="gramStart"/>
+      <w:r>
+        <w:rPr>
+          <w:i/>
+          <w:iCs/>
+          <w:sz w:val="20"/>
+          <w:szCs w:val="20"/>
+        </w:rPr>
+        <w:t>here)_</w:t>
+      </w:r>
+      <w:proofErr w:type="gramEnd"/>
+      <w:r>
+        <w:rPr>
+          <w:i/>
+          <w:iCs/>
+          <w:sz w:val="20"/>
+          <w:szCs w:val="20"/>
+        </w:rPr>
+        <w:t>_______________________________________________________________________</w:t>
       </w:r>
     </w:p>
     <w:p>
@@ -4859,7 +5533,15 @@
         <w:t xml:space="preserve"> </w:t>
       </w:r>
       <w:r>
-        <w:t>(now, anyone can delete by id)</w:t>
+        <w:t>(</w:t>
+      </w:r>
+      <w:proofErr w:type="gramStart"/>
+      <w:r>
+        <w:t>now</w:t>
+      </w:r>
+      <w:proofErr w:type="gramEnd"/>
+      <w:r>
+        <w:t>, anyone can delete by id)</w:t>
       </w:r>
       <w:r>
         <w:t>.</w:t>
@@ -5157,7 +5839,27 @@
           <w:sz w:val="20"/>
           <w:szCs w:val="20"/>
         </w:rPr>
-        <w:t>(Please answer here)________________________________________________________________________</w:t>
+        <w:t xml:space="preserve">(Please answer </w:t>
+      </w:r>
+      <w:proofErr w:type="gramStart"/>
+      <w:r>
+        <w:rPr>
+          <w:i/>
+          <w:iCs/>
+          <w:sz w:val="20"/>
+          <w:szCs w:val="20"/>
+        </w:rPr>
+        <w:t>here)_</w:t>
+      </w:r>
+      <w:proofErr w:type="gramEnd"/>
+      <w:r>
+        <w:rPr>
+          <w:i/>
+          <w:iCs/>
+          <w:sz w:val="20"/>
+          <w:szCs w:val="20"/>
+        </w:rPr>
+        <w:t>_______________________________________________________________________</w:t>
       </w:r>
     </w:p>
     <w:p>
@@ -5604,7 +6306,27 @@
           <w:sz w:val="20"/>
           <w:szCs w:val="20"/>
         </w:rPr>
-        <w:t>(Please answer here)________________________________________________________________________</w:t>
+        <w:t xml:space="preserve">(Please answer </w:t>
+      </w:r>
+      <w:proofErr w:type="gramStart"/>
+      <w:r>
+        <w:rPr>
+          <w:i/>
+          <w:iCs/>
+          <w:sz w:val="20"/>
+          <w:szCs w:val="20"/>
+        </w:rPr>
+        <w:t>here)_</w:t>
+      </w:r>
+      <w:proofErr w:type="gramEnd"/>
+      <w:r>
+        <w:rPr>
+          <w:i/>
+          <w:iCs/>
+          <w:sz w:val="20"/>
+          <w:szCs w:val="20"/>
+        </w:rPr>
+        <w:t>_______________________________________________________________________</w:t>
       </w:r>
     </w:p>
     <w:p/>

</xml_diff>